<commit_message>
add data to be collected finished
</commit_message>
<xml_diff>
--- a/Data related/Data to be collected.docx
+++ b/Data related/Data to be collected.docx
@@ -162,28 +162,47 @@
           <w:sz w:val="22"/>
           <w:szCs w:val="22"/>
         </w:rPr>
-        <w:t>Data to be collected and shown; job title, job location, posted data, an ID given to the job by our system usually “Generated strategy .IDENTITY”, a small job description that does not show any type of personal information per the legal document.</w:t>
-      </w:r>
-    </w:p>
-    <w:p>
-      <w:pPr>
-        <w:rPr>
-          <w:color w:val="000000" w:themeColor="text1"/>
-          <w:sz w:val="22"/>
-          <w:szCs w:val="22"/>
-        </w:rPr>
-      </w:pPr>
-    </w:p>
-    <w:p>
-      <w:pPr>
-        <w:rPr>
-          <w:rFonts w:asciiTheme="majorBidi" w:hAnsiTheme="majorBidi" w:cstheme="majorBidi"/>
-          <w:b/>
-          <w:bCs/>
-          <w:color w:val="000000" w:themeColor="text1"/>
-          <w:u w:val="single"/>
-        </w:rPr>
-      </w:pPr>
+        <w:t xml:space="preserve">Data to be collected and shown; job title, job location, posted data, an ID given to the job by our system usually “Generated </w:t>
+      </w:r>
+      <w:proofErr w:type="gramStart"/>
+      <w:r>
+        <w:rPr>
+          <w:color w:val="000000" w:themeColor="text1"/>
+          <w:sz w:val="22"/>
+          <w:szCs w:val="22"/>
+        </w:rPr>
+        <w:t>strategy .IDENTITY</w:t>
+      </w:r>
+      <w:proofErr w:type="gramEnd"/>
+      <w:r>
+        <w:rPr>
+          <w:color w:val="000000" w:themeColor="text1"/>
+          <w:sz w:val="22"/>
+          <w:szCs w:val="22"/>
+        </w:rPr>
+        <w:t>”, a small job description that does not show any type of personal information per the legal document.</w:t>
+      </w:r>
+    </w:p>
+    <w:p>
+      <w:pPr>
+        <w:rPr>
+          <w:color w:val="000000" w:themeColor="text1"/>
+          <w:sz w:val="22"/>
+          <w:szCs w:val="22"/>
+        </w:rPr>
+      </w:pPr>
+    </w:p>
+    <w:p>
+      <w:pPr>
+        <w:rPr>
+          <w:rFonts w:asciiTheme="majorBidi" w:hAnsiTheme="majorBidi" w:cstheme="majorBidi"/>
+          <w:b/>
+          <w:bCs/>
+          <w:color w:val="000000" w:themeColor="text1"/>
+          <w:u w:val="single"/>
+        </w:rPr>
+      </w:pPr>
+      <w:proofErr w:type="spellStart"/>
       <w:r>
         <w:rPr>
           <w:rFonts w:asciiTheme="majorBidi" w:hAnsiTheme="majorBidi" w:cstheme="majorBidi"/>
@@ -194,6 +213,7 @@
         </w:rPr>
         <w:t>SportsVerein</w:t>
       </w:r>
+      <w:proofErr w:type="spellEnd"/>
       <w:r>
         <w:rPr>
           <w:rFonts w:asciiTheme="majorBidi" w:hAnsiTheme="majorBidi" w:cstheme="majorBidi"/>
@@ -253,15 +273,27 @@
           <w:u w:val="single"/>
         </w:rPr>
       </w:pPr>
-      <w:r>
-        <w:rPr>
-          <w:rFonts w:asciiTheme="majorBidi" w:hAnsiTheme="majorBidi" w:cstheme="majorBidi"/>
-          <w:b/>
-          <w:bCs/>
-          <w:color w:val="000000" w:themeColor="text1"/>
-          <w:u w:val="single"/>
-        </w:rPr>
-        <w:t>Accomodation:</w:t>
+      <w:proofErr w:type="spellStart"/>
+      <w:r>
+        <w:rPr>
+          <w:rFonts w:asciiTheme="majorBidi" w:hAnsiTheme="majorBidi" w:cstheme="majorBidi"/>
+          <w:b/>
+          <w:bCs/>
+          <w:color w:val="000000" w:themeColor="text1"/>
+          <w:u w:val="single"/>
+        </w:rPr>
+        <w:t>Accomodation</w:t>
+      </w:r>
+      <w:proofErr w:type="spellEnd"/>
+      <w:r>
+        <w:rPr>
+          <w:rFonts w:asciiTheme="majorBidi" w:hAnsiTheme="majorBidi" w:cstheme="majorBidi"/>
+          <w:b/>
+          <w:bCs/>
+          <w:color w:val="000000" w:themeColor="text1"/>
+          <w:u w:val="single"/>
+        </w:rPr>
+        <w:t>:</w:t>
       </w:r>
     </w:p>
     <w:p>
@@ -291,7 +323,31 @@
           <w:sz w:val="22"/>
           <w:szCs w:val="22"/>
         </w:rPr>
-        <w:t>WG-Gesucht:</w:t>
+        <w:t>WG-</w:t>
+      </w:r>
+      <w:proofErr w:type="spellStart"/>
+      <w:r>
+        <w:rPr>
+          <w:rFonts w:cstheme="minorHAnsi"/>
+          <w:b/>
+          <w:bCs/>
+          <w:color w:val="000000" w:themeColor="text1"/>
+          <w:sz w:val="22"/>
+          <w:szCs w:val="22"/>
+        </w:rPr>
+        <w:t>Gesucht</w:t>
+      </w:r>
+      <w:proofErr w:type="spellEnd"/>
+      <w:r>
+        <w:rPr>
+          <w:rFonts w:cstheme="minorHAnsi"/>
+          <w:b/>
+          <w:bCs/>
+          <w:color w:val="000000" w:themeColor="text1"/>
+          <w:sz w:val="22"/>
+          <w:szCs w:val="22"/>
+        </w:rPr>
+        <w:t>:</w:t>
       </w:r>
       <w:r>
         <w:rPr>
@@ -366,79 +422,27 @@
           <w:sz w:val="22"/>
           <w:szCs w:val="22"/>
         </w:rPr>
-        <w:t>Dormitory name</w:t>
-      </w:r>
-      <w:r>
-        <w:rPr>
-          <w:rFonts w:cstheme="minorHAnsi"/>
-          <w:color w:val="000000" w:themeColor="text1"/>
-          <w:sz w:val="22"/>
-          <w:szCs w:val="22"/>
-        </w:rPr>
-        <w:t xml:space="preserve">, </w:t>
-      </w:r>
-      <w:r>
-        <w:rPr>
-          <w:rFonts w:cstheme="minorHAnsi"/>
-          <w:color w:val="000000" w:themeColor="text1"/>
-          <w:sz w:val="22"/>
-          <w:szCs w:val="22"/>
-        </w:rPr>
-        <w:t>Dormitory address (building only)</w:t>
-      </w:r>
-      <w:r>
-        <w:rPr>
-          <w:rFonts w:cstheme="minorHAnsi"/>
-          <w:color w:val="000000" w:themeColor="text1"/>
-          <w:sz w:val="22"/>
-          <w:szCs w:val="22"/>
-        </w:rPr>
-        <w:t xml:space="preserve">, number of rooms, </w:t>
-      </w:r>
-      <w:r>
-        <w:rPr>
-          <w:rFonts w:cstheme="minorHAnsi"/>
-          <w:color w:val="000000" w:themeColor="text1"/>
-          <w:sz w:val="22"/>
-          <w:szCs w:val="22"/>
-        </w:rPr>
-        <w:t>Rent prices (range or specific)</w:t>
-      </w:r>
-      <w:r>
-        <w:rPr>
-          <w:rFonts w:cstheme="minorHAnsi"/>
-          <w:color w:val="000000" w:themeColor="text1"/>
-          <w:sz w:val="22"/>
-          <w:szCs w:val="22"/>
-        </w:rPr>
-        <w:t xml:space="preserve">, </w:t>
-      </w:r>
-      <w:r>
-        <w:rPr>
-          <w:rFonts w:cstheme="minorHAnsi"/>
-          <w:color w:val="000000" w:themeColor="text1"/>
-          <w:sz w:val="22"/>
-          <w:szCs w:val="22"/>
-        </w:rPr>
-        <w:t>Room types available</w:t>
-      </w:r>
-      <w:r>
-        <w:rPr>
-          <w:rFonts w:cstheme="minorHAnsi"/>
-          <w:color w:val="000000" w:themeColor="text1"/>
-          <w:sz w:val="22"/>
-          <w:szCs w:val="22"/>
-        </w:rPr>
-        <w:t xml:space="preserve">, </w:t>
-      </w:r>
-      <w:r>
-        <w:rPr>
-          <w:rFonts w:cstheme="minorHAnsi"/>
-          <w:color w:val="000000" w:themeColor="text1"/>
-          <w:sz w:val="22"/>
-          <w:szCs w:val="22"/>
-        </w:rPr>
-        <w:t>Contact (general Studentenwerk email/phone)</w:t>
+        <w:t xml:space="preserve">Dormitory name, Dormitory address (building only), number of rooms, Rent prices (range or specific), Room types available, Contact (general </w:t>
+      </w:r>
+      <w:proofErr w:type="spellStart"/>
+      <w:r>
+        <w:rPr>
+          <w:rFonts w:cstheme="minorHAnsi"/>
+          <w:color w:val="000000" w:themeColor="text1"/>
+          <w:sz w:val="22"/>
+          <w:szCs w:val="22"/>
+        </w:rPr>
+        <w:t>Studentenwerk</w:t>
+      </w:r>
+      <w:proofErr w:type="spellEnd"/>
+      <w:r>
+        <w:rPr>
+          <w:rFonts w:cstheme="minorHAnsi"/>
+          <w:color w:val="000000" w:themeColor="text1"/>
+          <w:sz w:val="22"/>
+          <w:szCs w:val="22"/>
+        </w:rPr>
+        <w:t xml:space="preserve"> email/phone)</w:t>
       </w:r>
       <w:r>
         <w:rPr>
@@ -575,7 +579,108 @@
           <w:sz w:val="22"/>
           <w:szCs w:val="22"/>
         </w:rPr>
-        <w:t>. Two public picture but include no art.</w:t>
+        <w:t xml:space="preserve">. Two public </w:t>
+      </w:r>
+      <w:proofErr w:type="gramStart"/>
+      <w:r>
+        <w:rPr>
+          <w:rFonts w:cstheme="minorHAnsi"/>
+          <w:color w:val="000000" w:themeColor="text1"/>
+          <w:sz w:val="22"/>
+          <w:szCs w:val="22"/>
+        </w:rPr>
+        <w:t>picture</w:t>
+      </w:r>
+      <w:proofErr w:type="gramEnd"/>
+      <w:r>
+        <w:rPr>
+          <w:rFonts w:cstheme="minorHAnsi"/>
+          <w:color w:val="000000" w:themeColor="text1"/>
+          <w:sz w:val="22"/>
+          <w:szCs w:val="22"/>
+        </w:rPr>
+        <w:t xml:space="preserve"> but include no art.</w:t>
+      </w:r>
+    </w:p>
+    <w:p>
+      <w:pPr>
+        <w:rPr>
+          <w:rFonts w:cstheme="minorHAnsi"/>
+          <w:color w:val="000000" w:themeColor="text1"/>
+          <w:sz w:val="22"/>
+          <w:szCs w:val="22"/>
+        </w:rPr>
+      </w:pPr>
+      <w:r>
+        <w:rPr>
+          <w:rFonts w:cstheme="minorHAnsi"/>
+          <w:color w:val="000000" w:themeColor="text1"/>
+          <w:sz w:val="22"/>
+          <w:szCs w:val="22"/>
+        </w:rPr>
+        <w:t xml:space="preserve"> </w:t>
+      </w:r>
+    </w:p>
+    <w:p>
+      <w:pPr>
+        <w:rPr>
+          <w:rFonts w:asciiTheme="majorBidi" w:hAnsiTheme="majorBidi" w:cstheme="majorBidi"/>
+          <w:b/>
+          <w:bCs/>
+          <w:color w:val="000000" w:themeColor="text1"/>
+          <w:u w:val="single"/>
+        </w:rPr>
+      </w:pPr>
+      <w:r>
+        <w:rPr>
+          <w:rFonts w:asciiTheme="majorBidi" w:hAnsiTheme="majorBidi" w:cstheme="majorBidi"/>
+          <w:b/>
+          <w:bCs/>
+          <w:color w:val="000000" w:themeColor="text1"/>
+          <w:u w:val="single"/>
+        </w:rPr>
+        <w:t>Forum (Questions and Answers)</w:t>
+      </w:r>
+      <w:r>
+        <w:rPr>
+          <w:rFonts w:asciiTheme="majorBidi" w:hAnsiTheme="majorBidi" w:cstheme="majorBidi"/>
+          <w:b/>
+          <w:bCs/>
+          <w:color w:val="000000" w:themeColor="text1"/>
+          <w:u w:val="single"/>
+        </w:rPr>
+        <w:t>:</w:t>
+      </w:r>
+    </w:p>
+    <w:p>
+      <w:pPr>
+        <w:rPr>
+          <w:rFonts w:asciiTheme="majorBidi" w:hAnsiTheme="majorBidi" w:cstheme="majorBidi"/>
+          <w:b/>
+          <w:bCs/>
+          <w:color w:val="000000" w:themeColor="text1"/>
+          <w:u w:val="single"/>
+        </w:rPr>
+      </w:pPr>
+      <w:r>
+        <w:rPr>
+          <w:rFonts w:cstheme="minorHAnsi"/>
+          <w:color w:val="000000" w:themeColor="text1"/>
+          <w:sz w:val="22"/>
+          <w:szCs w:val="22"/>
+        </w:rPr>
+        <w:br/>
+        <w:t>Store user</w:t>
+      </w:r>
+      <w:r>
+        <w:rPr>
+          <w:rFonts w:cstheme="minorHAnsi"/>
+          <w:color w:val="000000" w:themeColor="text1"/>
+          <w:sz w:val="22"/>
+          <w:szCs w:val="22"/>
+        </w:rPr>
+        <w:noBreakHyphen/>
+        <w:t>posted questions and answers. Users may post a question and other users may answer it. Normal forum rules apply; no storage of personal data beyond what the user voluntarily includes in their post.</w:t>
       </w:r>
     </w:p>
     <w:sectPr>

</xml_diff>